<commit_message>
Aura-build inspired layout updated
</commit_message>
<xml_diff>
--- a/dist/KhoaHo_CV.docx
+++ b/dist/KhoaHo_CV.docx
@@ -148,7 +148,25 @@
               <w:szCs w:val="20"/>
               <w:lang w:val="en-VN"/>
             </w:rPr>
-            <w:t>www.linkedin.com/in/khoa-phan-ho-75771b2a9/</w:t>
+            <w:t>www.linkedin.com/in/khoa-phan-ho-</w:t>
+          </w:r>
+          <w:r>
+            <w:rPr>
+              <w:rStyle w:val="Hyperlink"/>
+              <w:color w:val="000000" w:themeColor="text1"/>
+              <w:szCs w:val="20"/>
+              <w:lang w:val="en-VN"/>
+            </w:rPr>
+            <w:t>7</w:t>
+          </w:r>
+          <w:r>
+            <w:rPr>
+              <w:rStyle w:val="Hyperlink"/>
+              <w:color w:val="000000" w:themeColor="text1"/>
+              <w:szCs w:val="20"/>
+              <w:lang w:val="en-VN"/>
+            </w:rPr>
+            <w:t>5771b2a9/</w:t>
           </w:r>
         </w:hyperlink>
         <w:r>
@@ -157,30 +175,52 @@
             <w:szCs w:val="20"/>
             <w:lang w:val="en-VN"/>
           </w:rPr>
-          <w:t xml:space="preserve"> | https://github.com/KayHo412</w:t>
+          <w:t xml:space="preserve"> | </w:t>
         </w:r>
+        <w:hyperlink r:id="rId12" w:history="1">
+          <w:r>
+            <w:rPr>
+              <w:rStyle w:val="Hyperlink"/>
+              <w:szCs w:val="20"/>
+              <w:lang w:val="en-VN"/>
+            </w:rPr>
+            <w:t>https://github.com/KayHo412</w:t>
+          </w:r>
+        </w:hyperlink>
         <w:r>
           <w:rPr>
             <w:color w:val="000000" w:themeColor="text1"/>
             <w:szCs w:val="20"/>
             <w:lang w:val="en-VN"/>
           </w:rPr>
-          <w:br/>
+          <w:t xml:space="preserve"> |                               </w:t>
         </w:r>
-        <w:r>
-          <w:rPr>
-            <w:color w:val="000000" w:themeColor="text1"/>
-            <w:szCs w:val="20"/>
-            <w:lang w:val="fi-FI"/>
-          </w:rPr>
-          <w:t>‬</w:t>
-        </w:r>
-        <w:r>
-          <w:rPr>
-            <w:lang w:val="fi-FI"/>
-          </w:rPr>
-          <w:t>‬</w:t>
-        </w:r>
+        <w:hyperlink r:id="rId13" w:history="1">
+          <w:r>
+            <w:rPr>
+              <w:rStyle w:val="Hyperlink"/>
+              <w:szCs w:val="20"/>
+              <w:lang w:val="en-VN"/>
+            </w:rPr>
+            <w:t>https://portfolio-87yc.</w:t>
+          </w:r>
+          <w:r>
+            <w:rPr>
+              <w:rStyle w:val="Hyperlink"/>
+              <w:szCs w:val="20"/>
+              <w:lang w:val="en-VN"/>
+            </w:rPr>
+            <w:t>v</w:t>
+          </w:r>
+          <w:r>
+            <w:rPr>
+              <w:rStyle w:val="Hyperlink"/>
+              <w:szCs w:val="20"/>
+              <w:lang w:val="en-VN"/>
+            </w:rPr>
+            <w:t>ercel.app/</w:t>
+          </w:r>
+        </w:hyperlink>
       </w:bdo>
     </w:p>
     <w:p>
@@ -1176,8 +1216,8 @@
       </w:r>
     </w:p>
     <w:sectPr>
-      <w:footerReference w:type="default" r:id="rId12"/>
-      <w:footerReference w:type="first" r:id="rId13"/>
+      <w:footerReference w:type="default" r:id="rId14"/>
+      <w:footerReference w:type="first" r:id="rId15"/>
       <w:type w:val="continuous"/>
       <w:pgSz w:w="12240" w:h="15840"/>
       <w:pgMar w:top="1008" w:right="1152" w:bottom="864" w:left="1152" w:header="288" w:footer="144" w:gutter="0"/>
@@ -6137,12 +6177,7 @@
 </file>
 
 <file path=customXml/item1.xml><?xml version="1.0" encoding="utf-8"?>
-<?mso-contentType ?>
-<FormTemplates xmlns="http://schemas.microsoft.com/sharepoint/v3/contenttype/forms">
-  <Display>DocumentLibraryForm</Display>
-  <Edit>DocumentLibraryForm</Edit>
-  <New>DocumentLibraryForm</New>
-</FormTemplates>
+<b:Sources xmlns:b="http://schemas.openxmlformats.org/officeDocument/2006/bibliography" xmlns="http://schemas.openxmlformats.org/officeDocument/2006/bibliography" SelectedStyle="\APASixthEditionOfficeOnline.xsl" StyleName="APA" Version="6"/>
 </file>
 
 <file path=customXml/item2.xml><?xml version="1.0" encoding="utf-8"?>
@@ -6458,7 +6493,12 @@
 </file>
 
 <file path=customXml/item3.xml><?xml version="1.0" encoding="utf-8"?>
-<b:Sources xmlns:b="http://schemas.openxmlformats.org/officeDocument/2006/bibliography" xmlns="http://schemas.openxmlformats.org/officeDocument/2006/bibliography" SelectedStyle="\APASixthEditionOfficeOnline.xsl" StyleName="APA" Version="6"/>
+<?mso-contentType ?>
+<FormTemplates xmlns="http://schemas.microsoft.com/sharepoint/v3/contenttype/forms">
+  <Display>DocumentLibraryForm</Display>
+  <Edit>DocumentLibraryForm</Edit>
+  <New>DocumentLibraryForm</New>
+</FormTemplates>
 </file>
 
 <file path=customXml/item4.xml><?xml version="1.0" encoding="utf-8"?>
@@ -6482,9 +6522,9 @@
 </file>
 
 <file path=customXml/itemProps1.xml><?xml version="1.0" encoding="utf-8"?>
-<ds:datastoreItem xmlns:ds="http://schemas.openxmlformats.org/officeDocument/2006/customXml" ds:itemID="{C03343B0-2E37-4E4D-9C2F-1BB515B811A5}">
+<ds:datastoreItem xmlns:ds="http://schemas.openxmlformats.org/officeDocument/2006/customXml" ds:itemID="{829E4964-E492-4D5C-A41E-6548D1BBBCF3}">
   <ds:schemaRefs>
-    <ds:schemaRef ds:uri="http://schemas.microsoft.com/sharepoint/v3/contenttype/forms"/>
+    <ds:schemaRef ds:uri="http://schemas.openxmlformats.org/officeDocument/2006/bibliography"/>
   </ds:schemaRefs>
 </ds:datastoreItem>
 </file>
@@ -6511,9 +6551,9 @@
 </file>
 
 <file path=customXml/itemProps3.xml><?xml version="1.0" encoding="utf-8"?>
-<ds:datastoreItem xmlns:ds="http://schemas.openxmlformats.org/officeDocument/2006/customXml" ds:itemID="{829E4964-E492-4D5C-A41E-6548D1BBBCF3}">
+<ds:datastoreItem xmlns:ds="http://schemas.openxmlformats.org/officeDocument/2006/customXml" ds:itemID="{C03343B0-2E37-4E4D-9C2F-1BB515B811A5}">
   <ds:schemaRefs>
-    <ds:schemaRef ds:uri="http://schemas.openxmlformats.org/officeDocument/2006/bibliography"/>
+    <ds:schemaRef ds:uri="http://schemas.microsoft.com/sharepoint/v3/contenttype/forms"/>
   </ds:schemaRefs>
 </ds:datastoreItem>
 </file>

</xml_diff>

<commit_message>
Fix : Renovate styles
</commit_message>
<xml_diff>
--- a/dist/KhoaHo_CV.docx
+++ b/dist/KhoaHo_CV.docx
@@ -148,25 +148,7 @@
               <w:szCs w:val="20"/>
               <w:lang w:val="en-VN"/>
             </w:rPr>
-            <w:t>www.linkedin.com/in/khoa-phan-ho-</w:t>
-          </w:r>
-          <w:r>
-            <w:rPr>
-              <w:rStyle w:val="Hyperlink"/>
-              <w:color w:val="000000" w:themeColor="text1"/>
-              <w:szCs w:val="20"/>
-              <w:lang w:val="en-VN"/>
-            </w:rPr>
-            <w:t>7</w:t>
-          </w:r>
-          <w:r>
-            <w:rPr>
-              <w:rStyle w:val="Hyperlink"/>
-              <w:color w:val="000000" w:themeColor="text1"/>
-              <w:szCs w:val="20"/>
-              <w:lang w:val="en-VN"/>
-            </w:rPr>
-            <w:t>5771b2a9/</w:t>
+            <w:t>www.linkedin.com/in/khoa-phan-ho-75771b2a9/</w:t>
           </w:r>
         </w:hyperlink>
         <w:r>
@@ -175,52 +157,30 @@
             <w:szCs w:val="20"/>
             <w:lang w:val="en-VN"/>
           </w:rPr>
-          <w:t xml:space="preserve"> | </w:t>
+          <w:t xml:space="preserve"> | https://github.com/KayHo412</w:t>
         </w:r>
-        <w:hyperlink r:id="rId12" w:history="1">
-          <w:r>
-            <w:rPr>
-              <w:rStyle w:val="Hyperlink"/>
-              <w:szCs w:val="20"/>
-              <w:lang w:val="en-VN"/>
-            </w:rPr>
-            <w:t>https://github.com/KayHo412</w:t>
-          </w:r>
-        </w:hyperlink>
         <w:r>
           <w:rPr>
             <w:color w:val="000000" w:themeColor="text1"/>
             <w:szCs w:val="20"/>
             <w:lang w:val="en-VN"/>
           </w:rPr>
-          <w:t xml:space="preserve"> |                               </w:t>
+          <w:br/>
         </w:r>
-        <w:hyperlink r:id="rId13" w:history="1">
-          <w:r>
-            <w:rPr>
-              <w:rStyle w:val="Hyperlink"/>
-              <w:szCs w:val="20"/>
-              <w:lang w:val="en-VN"/>
-            </w:rPr>
-            <w:t>https://portfolio-87yc.</w:t>
-          </w:r>
-          <w:r>
-            <w:rPr>
-              <w:rStyle w:val="Hyperlink"/>
-              <w:szCs w:val="20"/>
-              <w:lang w:val="en-VN"/>
-            </w:rPr>
-            <w:t>v</w:t>
-          </w:r>
-          <w:r>
-            <w:rPr>
-              <w:rStyle w:val="Hyperlink"/>
-              <w:szCs w:val="20"/>
-              <w:lang w:val="en-VN"/>
-            </w:rPr>
-            <w:t>ercel.app/</w:t>
-          </w:r>
-        </w:hyperlink>
+        <w:r>
+          <w:rPr>
+            <w:color w:val="000000" w:themeColor="text1"/>
+            <w:szCs w:val="20"/>
+            <w:lang w:val="fi-FI"/>
+          </w:rPr>
+          <w:t>‬</w:t>
+        </w:r>
+        <w:r>
+          <w:rPr>
+            <w:lang w:val="fi-FI"/>
+          </w:rPr>
+          <w:t>‬</w:t>
+        </w:r>
       </w:bdo>
     </w:p>
     <w:p>
@@ -1216,8 +1176,8 @@
       </w:r>
     </w:p>
     <w:sectPr>
-      <w:footerReference w:type="default" r:id="rId14"/>
-      <w:footerReference w:type="first" r:id="rId15"/>
+      <w:footerReference w:type="default" r:id="rId12"/>
+      <w:footerReference w:type="first" r:id="rId13"/>
       <w:type w:val="continuous"/>
       <w:pgSz w:w="12240" w:h="15840"/>
       <w:pgMar w:top="1008" w:right="1152" w:bottom="864" w:left="1152" w:header="288" w:footer="144" w:gutter="0"/>
@@ -6177,7 +6137,12 @@
 </file>
 
 <file path=customXml/item1.xml><?xml version="1.0" encoding="utf-8"?>
-<b:Sources xmlns:b="http://schemas.openxmlformats.org/officeDocument/2006/bibliography" xmlns="http://schemas.openxmlformats.org/officeDocument/2006/bibliography" SelectedStyle="\APASixthEditionOfficeOnline.xsl" StyleName="APA" Version="6"/>
+<?mso-contentType ?>
+<FormTemplates xmlns="http://schemas.microsoft.com/sharepoint/v3/contenttype/forms">
+  <Display>DocumentLibraryForm</Display>
+  <Edit>DocumentLibraryForm</Edit>
+  <New>DocumentLibraryForm</New>
+</FormTemplates>
 </file>
 
 <file path=customXml/item2.xml><?xml version="1.0" encoding="utf-8"?>
@@ -6493,12 +6458,7 @@
 </file>
 
 <file path=customXml/item3.xml><?xml version="1.0" encoding="utf-8"?>
-<?mso-contentType ?>
-<FormTemplates xmlns="http://schemas.microsoft.com/sharepoint/v3/contenttype/forms">
-  <Display>DocumentLibraryForm</Display>
-  <Edit>DocumentLibraryForm</Edit>
-  <New>DocumentLibraryForm</New>
-</FormTemplates>
+<b:Sources xmlns:b="http://schemas.openxmlformats.org/officeDocument/2006/bibliography" xmlns="http://schemas.openxmlformats.org/officeDocument/2006/bibliography" SelectedStyle="\APASixthEditionOfficeOnline.xsl" StyleName="APA" Version="6"/>
 </file>
 
 <file path=customXml/item4.xml><?xml version="1.0" encoding="utf-8"?>
@@ -6522,9 +6482,9 @@
 </file>
 
 <file path=customXml/itemProps1.xml><?xml version="1.0" encoding="utf-8"?>
-<ds:datastoreItem xmlns:ds="http://schemas.openxmlformats.org/officeDocument/2006/customXml" ds:itemID="{829E4964-E492-4D5C-A41E-6548D1BBBCF3}">
+<ds:datastoreItem xmlns:ds="http://schemas.openxmlformats.org/officeDocument/2006/customXml" ds:itemID="{C03343B0-2E37-4E4D-9C2F-1BB515B811A5}">
   <ds:schemaRefs>
-    <ds:schemaRef ds:uri="http://schemas.openxmlformats.org/officeDocument/2006/bibliography"/>
+    <ds:schemaRef ds:uri="http://schemas.microsoft.com/sharepoint/v3/contenttype/forms"/>
   </ds:schemaRefs>
 </ds:datastoreItem>
 </file>
@@ -6551,9 +6511,9 @@
 </file>
 
 <file path=customXml/itemProps3.xml><?xml version="1.0" encoding="utf-8"?>
-<ds:datastoreItem xmlns:ds="http://schemas.openxmlformats.org/officeDocument/2006/customXml" ds:itemID="{C03343B0-2E37-4E4D-9C2F-1BB515B811A5}">
+<ds:datastoreItem xmlns:ds="http://schemas.openxmlformats.org/officeDocument/2006/customXml" ds:itemID="{829E4964-E492-4D5C-A41E-6548D1BBBCF3}">
   <ds:schemaRefs>
-    <ds:schemaRef ds:uri="http://schemas.microsoft.com/sharepoint/v3/contenttype/forms"/>
+    <ds:schemaRef ds:uri="http://schemas.openxmlformats.org/officeDocument/2006/bibliography"/>
   </ds:schemaRefs>
 </ds:datastoreItem>
 </file>

</xml_diff>